<commit_message>
made further changes to diagram and memorandum
</commit_message>
<xml_diff>
--- a/Memorandum.docx
+++ b/Memorandum.docx
@@ -4,6 +4,7 @@
   <w:body>
     <w:p>
       <w:pPr>
+        <w:spacing w:line="240" w:lineRule="auto"/>
         <w:jc w:val="center"/>
         <w:rPr>
           <w:rFonts w:ascii="Arial" w:hAnsi="Arial" w:cs="Arial"/>
@@ -28,6 +29,26 @@
     </w:p>
     <w:p>
       <w:pPr>
+        <w:spacing w:line="240" w:lineRule="auto"/>
+        <w:jc w:val="both"/>
+        <w:rPr>
+          <w:rFonts w:ascii="Arial" w:hAnsi="Arial" w:cs="Arial"/>
+          <w:sz w:val="20"/>
+          <w:szCs w:val="20"/>
+        </w:rPr>
+      </w:pPr>
+      <w:r>
+        <w:rPr>
+          <w:rFonts w:ascii="Arial" w:hAnsi="Arial" w:cs="Arial"/>
+          <w:sz w:val="20"/>
+          <w:szCs w:val="20"/>
+        </w:rPr>
+        <w:t>The task is to create a partially autonomous system for session catering.</w:t>
+      </w:r>
+    </w:p>
+    <w:p>
+      <w:pPr>
+        <w:spacing w:line="240" w:lineRule="auto"/>
         <w:jc w:val="both"/>
         <w:rPr>
           <w:rFonts w:ascii="Arial" w:hAnsi="Arial" w:cs="Arial"/>
@@ -45,14 +66,292 @@
           <w:sz w:val="24"/>
           <w:szCs w:val="24"/>
         </w:rPr>
+        <w:t xml:space="preserve">Key </w:t>
+      </w:r>
+      <w:r>
+        <w:rPr>
+          <w:rFonts w:ascii="Arial" w:hAnsi="Arial" w:cs="Arial"/>
+          <w:b/>
+          <w:bCs/>
+          <w:sz w:val="24"/>
+          <w:szCs w:val="24"/>
+        </w:rPr>
         <w:t>Requirements</w:t>
       </w:r>
     </w:p>
     <w:p>
       <w:pPr>
+        <w:pStyle w:val="ListParagraph"/>
+        <w:numPr>
+          <w:ilvl w:val="0"/>
+          <w:numId w:val="2"/>
+        </w:numPr>
+        <w:spacing w:line="240" w:lineRule="auto"/>
         <w:jc w:val="both"/>
         <w:rPr>
           <w:rFonts w:ascii="Arial" w:hAnsi="Arial" w:cs="Arial"/>
+          <w:sz w:val="20"/>
+          <w:szCs w:val="20"/>
+        </w:rPr>
+      </w:pPr>
+      <w:r>
+        <w:rPr>
+          <w:rFonts w:ascii="Arial" w:hAnsi="Arial" w:cs="Arial"/>
+          <w:sz w:val="20"/>
+          <w:szCs w:val="20"/>
+        </w:rPr>
+        <w:t>Create a structured and organised database to replace the csv/pdf mess</w:t>
+      </w:r>
+    </w:p>
+    <w:p>
+      <w:pPr>
+        <w:pStyle w:val="ListParagraph"/>
+        <w:numPr>
+          <w:ilvl w:val="0"/>
+          <w:numId w:val="2"/>
+        </w:numPr>
+        <w:spacing w:line="240" w:lineRule="auto"/>
+        <w:jc w:val="both"/>
+        <w:rPr>
+          <w:rFonts w:ascii="Arial" w:hAnsi="Arial" w:cs="Arial"/>
+          <w:sz w:val="20"/>
+          <w:szCs w:val="20"/>
+        </w:rPr>
+      </w:pPr>
+      <w:r>
+        <w:rPr>
+          <w:rFonts w:ascii="Arial" w:hAnsi="Arial" w:cs="Arial"/>
+          <w:sz w:val="20"/>
+          <w:szCs w:val="20"/>
+        </w:rPr>
+        <w:t>Create some level of automation to produce catering orders</w:t>
+      </w:r>
+    </w:p>
+    <w:p>
+      <w:pPr>
+        <w:pStyle w:val="ListParagraph"/>
+        <w:numPr>
+          <w:ilvl w:val="0"/>
+          <w:numId w:val="2"/>
+        </w:numPr>
+        <w:spacing w:line="240" w:lineRule="auto"/>
+        <w:jc w:val="both"/>
+        <w:rPr>
+          <w:rFonts w:ascii="Arial" w:hAnsi="Arial" w:cs="Arial"/>
+          <w:sz w:val="20"/>
+          <w:szCs w:val="20"/>
+        </w:rPr>
+      </w:pPr>
+      <w:r>
+        <w:rPr>
+          <w:rFonts w:ascii="Arial" w:hAnsi="Arial" w:cs="Arial"/>
+          <w:sz w:val="20"/>
+          <w:szCs w:val="20"/>
+        </w:rPr>
+        <w:t>Deliver some interface for Carmen to interact with when placing orders</w:t>
+      </w:r>
+    </w:p>
+    <w:p>
+      <w:pPr>
+        <w:pStyle w:val="ListParagraph"/>
+        <w:numPr>
+          <w:ilvl w:val="0"/>
+          <w:numId w:val="2"/>
+        </w:numPr>
+        <w:spacing w:line="240" w:lineRule="auto"/>
+        <w:jc w:val="both"/>
+        <w:rPr>
+          <w:rFonts w:ascii="Arial" w:hAnsi="Arial" w:cs="Arial"/>
+          <w:sz w:val="20"/>
+          <w:szCs w:val="20"/>
+        </w:rPr>
+      </w:pPr>
+      <w:r>
+        <w:rPr>
+          <w:rFonts w:ascii="Arial" w:hAnsi="Arial" w:cs="Arial"/>
+          <w:sz w:val="20"/>
+          <w:szCs w:val="20"/>
+        </w:rPr>
+        <w:t>Create an interface to ingest new data that may need to be added.</w:t>
+      </w:r>
+    </w:p>
+    <w:p>
+      <w:pPr>
+        <w:spacing w:line="240" w:lineRule="auto"/>
+        <w:jc w:val="both"/>
+        <w:rPr>
+          <w:rFonts w:ascii="Arial" w:hAnsi="Arial" w:cs="Arial"/>
+          <w:b/>
+          <w:bCs/>
+          <w:sz w:val="24"/>
+          <w:szCs w:val="24"/>
+        </w:rPr>
+      </w:pPr>
+      <w:r>
+        <w:rPr>
+          <w:rFonts w:ascii="Arial" w:hAnsi="Arial" w:cs="Arial"/>
+          <w:b/>
+          <w:bCs/>
+          <w:sz w:val="24"/>
+          <w:szCs w:val="24"/>
+        </w:rPr>
+        <w:t>Automation ideas (in priority order)</w:t>
+      </w:r>
+    </w:p>
+    <w:p>
+      <w:pPr>
+        <w:pStyle w:val="ListParagraph"/>
+        <w:numPr>
+          <w:ilvl w:val="0"/>
+          <w:numId w:val="3"/>
+        </w:numPr>
+        <w:spacing w:line="240" w:lineRule="auto"/>
+        <w:jc w:val="both"/>
+        <w:rPr>
+          <w:rFonts w:ascii="Arial" w:hAnsi="Arial" w:cs="Arial"/>
+          <w:sz w:val="20"/>
+          <w:szCs w:val="20"/>
+        </w:rPr>
+      </w:pPr>
+      <w:r>
+        <w:rPr>
+          <w:rFonts w:ascii="Arial" w:hAnsi="Arial" w:cs="Arial"/>
+          <w:sz w:val="20"/>
+          <w:szCs w:val="20"/>
+        </w:rPr>
+        <w:t>Automate order creation for fixed caterers and fixed number of students</w:t>
+      </w:r>
+    </w:p>
+    <w:p>
+      <w:pPr>
+        <w:pStyle w:val="ListParagraph"/>
+        <w:numPr>
+          <w:ilvl w:val="0"/>
+          <w:numId w:val="3"/>
+        </w:numPr>
+        <w:spacing w:line="240" w:lineRule="auto"/>
+        <w:jc w:val="both"/>
+        <w:rPr>
+          <w:rFonts w:ascii="Arial" w:hAnsi="Arial" w:cs="Arial"/>
+          <w:sz w:val="20"/>
+          <w:szCs w:val="20"/>
+        </w:rPr>
+      </w:pPr>
+      <w:r>
+        <w:rPr>
+          <w:rFonts w:ascii="Arial" w:hAnsi="Arial" w:cs="Arial"/>
+          <w:sz w:val="20"/>
+          <w:szCs w:val="20"/>
+        </w:rPr>
+        <w:t>Factor in absences</w:t>
+      </w:r>
+    </w:p>
+    <w:p>
+      <w:pPr>
+        <w:pStyle w:val="ListParagraph"/>
+        <w:numPr>
+          <w:ilvl w:val="0"/>
+          <w:numId w:val="3"/>
+        </w:numPr>
+        <w:spacing w:line="240" w:lineRule="auto"/>
+        <w:jc w:val="both"/>
+        <w:rPr>
+          <w:rFonts w:ascii="Arial" w:hAnsi="Arial" w:cs="Arial"/>
+          <w:sz w:val="20"/>
+          <w:szCs w:val="20"/>
+        </w:rPr>
+      </w:pPr>
+      <w:r>
+        <w:rPr>
+          <w:rFonts w:ascii="Arial" w:hAnsi="Arial" w:cs="Arial"/>
+          <w:sz w:val="20"/>
+          <w:szCs w:val="20"/>
+        </w:rPr>
+        <w:t>Optimise for price</w:t>
+      </w:r>
+    </w:p>
+    <w:p>
+      <w:pPr>
+        <w:pStyle w:val="ListParagraph"/>
+        <w:numPr>
+          <w:ilvl w:val="0"/>
+          <w:numId w:val="3"/>
+        </w:numPr>
+        <w:spacing w:line="240" w:lineRule="auto"/>
+        <w:jc w:val="both"/>
+        <w:rPr>
+          <w:rFonts w:ascii="Arial" w:hAnsi="Arial" w:cs="Arial"/>
+          <w:sz w:val="20"/>
+          <w:szCs w:val="20"/>
+        </w:rPr>
+      </w:pPr>
+      <w:r>
+        <w:rPr>
+          <w:rFonts w:ascii="Arial" w:hAnsi="Arial" w:cs="Arial"/>
+          <w:sz w:val="20"/>
+          <w:szCs w:val="20"/>
+        </w:rPr>
+        <w:t>Include manager feedback</w:t>
+      </w:r>
+      <w:r>
+        <w:rPr>
+          <w:rFonts w:ascii="Arial" w:hAnsi="Arial" w:cs="Arial"/>
+          <w:sz w:val="20"/>
+          <w:szCs w:val="20"/>
+        </w:rPr>
+        <w:t xml:space="preserve"> and detect quality drift</w:t>
+      </w:r>
+    </w:p>
+    <w:p>
+      <w:pPr>
+        <w:spacing w:line="240" w:lineRule="auto"/>
+        <w:jc w:val="both"/>
+        <w:rPr>
+          <w:rFonts w:ascii="Arial" w:hAnsi="Arial" w:cs="Arial"/>
+          <w:b/>
+          <w:bCs/>
+          <w:sz w:val="24"/>
+          <w:szCs w:val="24"/>
+        </w:rPr>
+      </w:pPr>
+      <w:r>
+        <w:rPr>
+          <w:rFonts w:ascii="Arial" w:hAnsi="Arial" w:cs="Arial"/>
+          <w:b/>
+          <w:bCs/>
+          <w:sz w:val="24"/>
+          <w:szCs w:val="24"/>
+        </w:rPr>
+        <w:t>Philosophy</w:t>
+      </w:r>
+    </w:p>
+    <w:p>
+      <w:pPr>
+        <w:spacing w:line="240" w:lineRule="auto"/>
+        <w:jc w:val="both"/>
+        <w:rPr>
+          <w:rFonts w:ascii="Arial" w:hAnsi="Arial" w:cs="Arial"/>
+          <w:sz w:val="20"/>
+          <w:szCs w:val="20"/>
+        </w:rPr>
+      </w:pPr>
+      <w:r>
+        <w:rPr>
+          <w:rFonts w:ascii="Arial" w:hAnsi="Arial" w:cs="Arial"/>
+          <w:sz w:val="20"/>
+          <w:szCs w:val="20"/>
+        </w:rPr>
+        <w:t>Design something stupidly simple that works first, then extend repeatedly, ensuring a stable functional version is created after every extension.</w:t>
+      </w:r>
+    </w:p>
+    <w:p>
+      <w:pPr>
+        <w:spacing w:line="240" w:lineRule="auto"/>
+        <w:jc w:val="both"/>
+        <w:rPr>
+          <w:rFonts w:ascii="Arial" w:hAnsi="Arial" w:cs="Arial"/>
+          <w:sz w:val="20"/>
+          <w:szCs w:val="20"/>
         </w:rPr>
       </w:pPr>
     </w:p>
@@ -64,6 +363,333 @@
     </w:sectPr>
   </w:body>
 </w:document>
+</file>
+
+<file path=word/numbering.xml><?xml version="1.0" encoding="utf-8"?>
+<w:numbering xmlns:wpc="http://schemas.microsoft.com/office/word/2010/wordprocessingCanvas" xmlns:cx="http://schemas.microsoft.com/office/drawing/2014/chartex" xmlns:cx1="http://schemas.microsoft.com/office/drawing/2015/9/8/chartex" xmlns:cx2="http://schemas.microsoft.com/office/drawing/2015/10/21/chartex" xmlns:cx3="http://schemas.microsoft.com/office/drawing/2016/5/9/chartex" xmlns:cx4="http://schemas.microsoft.com/office/drawing/2016/5/10/chartex" xmlns:cx5="http://schemas.microsoft.com/office/drawing/2016/5/11/chartex" xmlns:cx6="http://schemas.microsoft.com/office/drawing/2016/5/12/chartex" xmlns:cx7="http://schemas.microsoft.com/office/drawing/2016/5/13/chartex" xmlns:cx8="http://schemas.microsoft.com/office/drawing/2016/5/14/chartex" xmlns:mc="http://schemas.openxmlformats.org/markup-compatibility/2006" xmlns:aink="http://schemas.microsoft.com/office/drawing/2016/ink" xmlns:am3d="http://schemas.microsoft.com/office/drawing/2017/model3d" xmlns:o="urn:schemas-microsoft-com:office:office" xmlns:oel="http://schemas.microsoft.com/office/2019/extlst" xmlns:r="http://schemas.openxmlformats.org/officeDocument/2006/relationships" xmlns:m="http://schemas.openxmlformats.org/officeDocument/2006/math" xmlns:v="urn:schemas-microsoft-com:vml" xmlns:wp14="http://schemas.microsoft.com/office/word/2010/wordprocessingDrawing" xmlns:wp="http://schemas.openxmlformats.org/drawingml/2006/wordprocessingDrawing" xmlns:w10="urn:schemas-microsoft-com:office:word" xmlns:w="http://schemas.openxmlformats.org/wordprocessingml/2006/main" xmlns:w14="http://schemas.microsoft.com/office/word/2010/wordml" xmlns:w15="http://schemas.microsoft.com/office/word/2012/wordml" xmlns:w16cex="http://schemas.microsoft.com/office/word/2018/wordml/cex" xmlns:w16cid="http://schemas.microsoft.com/office/word/2016/wordml/cid" xmlns:w16="http://schemas.microsoft.com/office/word/2018/wordml" xmlns:w16du="http://schemas.microsoft.com/office/word/2023/wordml/word16du" xmlns:w16sdtdh="http://schemas.microsoft.com/office/word/2020/wordml/sdtdatahash" xmlns:w16sdtfl="http://schemas.microsoft.com/office/word/2024/wordml/sdtformatlock" xmlns:w16se="http://schemas.microsoft.com/office/word/2015/wordml/symex" xmlns:wpg="http://schemas.microsoft.com/office/word/2010/wordprocessingGroup" xmlns:wpi="http://schemas.microsoft.com/office/word/2010/wordprocessingInk" xmlns:wne="http://schemas.microsoft.com/office/word/2006/wordml" xmlns:wps="http://schemas.microsoft.com/office/word/2010/wordprocessingShape" mc:Ignorable="w14 w15 w16se w16cid w16 w16cex w16sdtdh w16sdtfl w16du wp14">
+  <w:abstractNum w:abstractNumId="0" w15:restartNumberingAfterBreak="0">
+    <w:nsid w:val="42365D56"/>
+    <w:multiLevelType w:val="hybridMultilevel"/>
+    <w:tmpl w:val="0BDE8138"/>
+    <w:lvl w:ilvl="0" w:tplc="5AA4B6FA">
+      <w:numFmt w:val="bullet"/>
+      <w:lvlText w:val="-"/>
+      <w:lvlJc w:val="left"/>
+      <w:pPr>
+        <w:ind w:left="720" w:hanging="360"/>
+      </w:pPr>
+      <w:rPr>
+        <w:rFonts w:ascii="Arial" w:eastAsiaTheme="minorHAnsi" w:hAnsi="Arial" w:cs="Arial" w:hint="default"/>
+      </w:rPr>
+    </w:lvl>
+    <w:lvl w:ilvl="1" w:tplc="0C090003" w:tentative="1">
+      <w:start w:val="1"/>
+      <w:numFmt w:val="bullet"/>
+      <w:lvlText w:val="o"/>
+      <w:lvlJc w:val="left"/>
+      <w:pPr>
+        <w:ind w:left="1440" w:hanging="360"/>
+      </w:pPr>
+      <w:rPr>
+        <w:rFonts w:ascii="Courier New" w:hAnsi="Courier New" w:cs="Courier New" w:hint="default"/>
+      </w:rPr>
+    </w:lvl>
+    <w:lvl w:ilvl="2" w:tplc="0C090005" w:tentative="1">
+      <w:start w:val="1"/>
+      <w:numFmt w:val="bullet"/>
+      <w:lvlText w:val=""/>
+      <w:lvlJc w:val="left"/>
+      <w:pPr>
+        <w:ind w:left="2160" w:hanging="360"/>
+      </w:pPr>
+      <w:rPr>
+        <w:rFonts w:ascii="Wingdings" w:hAnsi="Wingdings" w:hint="default"/>
+      </w:rPr>
+    </w:lvl>
+    <w:lvl w:ilvl="3" w:tplc="0C090001" w:tentative="1">
+      <w:start w:val="1"/>
+      <w:numFmt w:val="bullet"/>
+      <w:lvlText w:val=""/>
+      <w:lvlJc w:val="left"/>
+      <w:pPr>
+        <w:ind w:left="2880" w:hanging="360"/>
+      </w:pPr>
+      <w:rPr>
+        <w:rFonts w:ascii="Symbol" w:hAnsi="Symbol" w:hint="default"/>
+      </w:rPr>
+    </w:lvl>
+    <w:lvl w:ilvl="4" w:tplc="0C090003" w:tentative="1">
+      <w:start w:val="1"/>
+      <w:numFmt w:val="bullet"/>
+      <w:lvlText w:val="o"/>
+      <w:lvlJc w:val="left"/>
+      <w:pPr>
+        <w:ind w:left="3600" w:hanging="360"/>
+      </w:pPr>
+      <w:rPr>
+        <w:rFonts w:ascii="Courier New" w:hAnsi="Courier New" w:cs="Courier New" w:hint="default"/>
+      </w:rPr>
+    </w:lvl>
+    <w:lvl w:ilvl="5" w:tplc="0C090005" w:tentative="1">
+      <w:start w:val="1"/>
+      <w:numFmt w:val="bullet"/>
+      <w:lvlText w:val=""/>
+      <w:lvlJc w:val="left"/>
+      <w:pPr>
+        <w:ind w:left="4320" w:hanging="360"/>
+      </w:pPr>
+      <w:rPr>
+        <w:rFonts w:ascii="Wingdings" w:hAnsi="Wingdings" w:hint="default"/>
+      </w:rPr>
+    </w:lvl>
+    <w:lvl w:ilvl="6" w:tplc="0C090001" w:tentative="1">
+      <w:start w:val="1"/>
+      <w:numFmt w:val="bullet"/>
+      <w:lvlText w:val=""/>
+      <w:lvlJc w:val="left"/>
+      <w:pPr>
+        <w:ind w:left="5040" w:hanging="360"/>
+      </w:pPr>
+      <w:rPr>
+        <w:rFonts w:ascii="Symbol" w:hAnsi="Symbol" w:hint="default"/>
+      </w:rPr>
+    </w:lvl>
+    <w:lvl w:ilvl="7" w:tplc="0C090003" w:tentative="1">
+      <w:start w:val="1"/>
+      <w:numFmt w:val="bullet"/>
+      <w:lvlText w:val="o"/>
+      <w:lvlJc w:val="left"/>
+      <w:pPr>
+        <w:ind w:left="5760" w:hanging="360"/>
+      </w:pPr>
+      <w:rPr>
+        <w:rFonts w:ascii="Courier New" w:hAnsi="Courier New" w:cs="Courier New" w:hint="default"/>
+      </w:rPr>
+    </w:lvl>
+    <w:lvl w:ilvl="8" w:tplc="0C090005" w:tentative="1">
+      <w:start w:val="1"/>
+      <w:numFmt w:val="bullet"/>
+      <w:lvlText w:val=""/>
+      <w:lvlJc w:val="left"/>
+      <w:pPr>
+        <w:ind w:left="6480" w:hanging="360"/>
+      </w:pPr>
+      <w:rPr>
+        <w:rFonts w:ascii="Wingdings" w:hAnsi="Wingdings" w:hint="default"/>
+      </w:rPr>
+    </w:lvl>
+  </w:abstractNum>
+  <w:abstractNum w:abstractNumId="1" w15:restartNumberingAfterBreak="0">
+    <w:nsid w:val="64933710"/>
+    <w:multiLevelType w:val="hybridMultilevel"/>
+    <w:tmpl w:val="A0E623CE"/>
+    <w:lvl w:ilvl="0" w:tplc="0C09000F">
+      <w:start w:val="1"/>
+      <w:numFmt w:val="decimal"/>
+      <w:lvlText w:val="%1."/>
+      <w:lvlJc w:val="left"/>
+      <w:pPr>
+        <w:ind w:left="720" w:hanging="360"/>
+      </w:pPr>
+      <w:rPr>
+        <w:rFonts w:hint="default"/>
+      </w:rPr>
+    </w:lvl>
+    <w:lvl w:ilvl="1" w:tplc="0C090019" w:tentative="1">
+      <w:start w:val="1"/>
+      <w:numFmt w:val="lowerLetter"/>
+      <w:lvlText w:val="%2."/>
+      <w:lvlJc w:val="left"/>
+      <w:pPr>
+        <w:ind w:left="1440" w:hanging="360"/>
+      </w:pPr>
+    </w:lvl>
+    <w:lvl w:ilvl="2" w:tplc="0C09001B" w:tentative="1">
+      <w:start w:val="1"/>
+      <w:numFmt w:val="lowerRoman"/>
+      <w:lvlText w:val="%3."/>
+      <w:lvlJc w:val="right"/>
+      <w:pPr>
+        <w:ind w:left="2160" w:hanging="180"/>
+      </w:pPr>
+    </w:lvl>
+    <w:lvl w:ilvl="3" w:tplc="0C09000F" w:tentative="1">
+      <w:start w:val="1"/>
+      <w:numFmt w:val="decimal"/>
+      <w:lvlText w:val="%4."/>
+      <w:lvlJc w:val="left"/>
+      <w:pPr>
+        <w:ind w:left="2880" w:hanging="360"/>
+      </w:pPr>
+    </w:lvl>
+    <w:lvl w:ilvl="4" w:tplc="0C090019" w:tentative="1">
+      <w:start w:val="1"/>
+      <w:numFmt w:val="lowerLetter"/>
+      <w:lvlText w:val="%5."/>
+      <w:lvlJc w:val="left"/>
+      <w:pPr>
+        <w:ind w:left="3600" w:hanging="360"/>
+      </w:pPr>
+    </w:lvl>
+    <w:lvl w:ilvl="5" w:tplc="0C09001B" w:tentative="1">
+      <w:start w:val="1"/>
+      <w:numFmt w:val="lowerRoman"/>
+      <w:lvlText w:val="%6."/>
+      <w:lvlJc w:val="right"/>
+      <w:pPr>
+        <w:ind w:left="4320" w:hanging="180"/>
+      </w:pPr>
+    </w:lvl>
+    <w:lvl w:ilvl="6" w:tplc="0C09000F" w:tentative="1">
+      <w:start w:val="1"/>
+      <w:numFmt w:val="decimal"/>
+      <w:lvlText w:val="%7."/>
+      <w:lvlJc w:val="left"/>
+      <w:pPr>
+        <w:ind w:left="5040" w:hanging="360"/>
+      </w:pPr>
+    </w:lvl>
+    <w:lvl w:ilvl="7" w:tplc="0C090019" w:tentative="1">
+      <w:start w:val="1"/>
+      <w:numFmt w:val="lowerLetter"/>
+      <w:lvlText w:val="%8."/>
+      <w:lvlJc w:val="left"/>
+      <w:pPr>
+        <w:ind w:left="5760" w:hanging="360"/>
+      </w:pPr>
+    </w:lvl>
+    <w:lvl w:ilvl="8" w:tplc="0C09001B" w:tentative="1">
+      <w:start w:val="1"/>
+      <w:numFmt w:val="lowerRoman"/>
+      <w:lvlText w:val="%9."/>
+      <w:lvlJc w:val="right"/>
+      <w:pPr>
+        <w:ind w:left="6480" w:hanging="180"/>
+      </w:pPr>
+    </w:lvl>
+  </w:abstractNum>
+  <w:abstractNum w:abstractNumId="2" w15:restartNumberingAfterBreak="0">
+    <w:nsid w:val="659F641D"/>
+    <w:multiLevelType w:val="hybridMultilevel"/>
+    <w:tmpl w:val="56522096"/>
+    <w:lvl w:ilvl="0" w:tplc="308A9660">
+      <w:numFmt w:val="bullet"/>
+      <w:lvlText w:val="-"/>
+      <w:lvlJc w:val="left"/>
+      <w:pPr>
+        <w:ind w:left="720" w:hanging="360"/>
+      </w:pPr>
+      <w:rPr>
+        <w:rFonts w:ascii="Arial" w:eastAsiaTheme="minorHAnsi" w:hAnsi="Arial" w:cs="Arial" w:hint="default"/>
+      </w:rPr>
+    </w:lvl>
+    <w:lvl w:ilvl="1" w:tplc="0C090003" w:tentative="1">
+      <w:start w:val="1"/>
+      <w:numFmt w:val="bullet"/>
+      <w:lvlText w:val="o"/>
+      <w:lvlJc w:val="left"/>
+      <w:pPr>
+        <w:ind w:left="1440" w:hanging="360"/>
+      </w:pPr>
+      <w:rPr>
+        <w:rFonts w:ascii="Courier New" w:hAnsi="Courier New" w:cs="Courier New" w:hint="default"/>
+      </w:rPr>
+    </w:lvl>
+    <w:lvl w:ilvl="2" w:tplc="0C090005" w:tentative="1">
+      <w:start w:val="1"/>
+      <w:numFmt w:val="bullet"/>
+      <w:lvlText w:val=""/>
+      <w:lvlJc w:val="left"/>
+      <w:pPr>
+        <w:ind w:left="2160" w:hanging="360"/>
+      </w:pPr>
+      <w:rPr>
+        <w:rFonts w:ascii="Wingdings" w:hAnsi="Wingdings" w:hint="default"/>
+      </w:rPr>
+    </w:lvl>
+    <w:lvl w:ilvl="3" w:tplc="0C090001" w:tentative="1">
+      <w:start w:val="1"/>
+      <w:numFmt w:val="bullet"/>
+      <w:lvlText w:val=""/>
+      <w:lvlJc w:val="left"/>
+      <w:pPr>
+        <w:ind w:left="2880" w:hanging="360"/>
+      </w:pPr>
+      <w:rPr>
+        <w:rFonts w:ascii="Symbol" w:hAnsi="Symbol" w:hint="default"/>
+      </w:rPr>
+    </w:lvl>
+    <w:lvl w:ilvl="4" w:tplc="0C090003" w:tentative="1">
+      <w:start w:val="1"/>
+      <w:numFmt w:val="bullet"/>
+      <w:lvlText w:val="o"/>
+      <w:lvlJc w:val="left"/>
+      <w:pPr>
+        <w:ind w:left="3600" w:hanging="360"/>
+      </w:pPr>
+      <w:rPr>
+        <w:rFonts w:ascii="Courier New" w:hAnsi="Courier New" w:cs="Courier New" w:hint="default"/>
+      </w:rPr>
+    </w:lvl>
+    <w:lvl w:ilvl="5" w:tplc="0C090005" w:tentative="1">
+      <w:start w:val="1"/>
+      <w:numFmt w:val="bullet"/>
+      <w:lvlText w:val=""/>
+      <w:lvlJc w:val="left"/>
+      <w:pPr>
+        <w:ind w:left="4320" w:hanging="360"/>
+      </w:pPr>
+      <w:rPr>
+        <w:rFonts w:ascii="Wingdings" w:hAnsi="Wingdings" w:hint="default"/>
+      </w:rPr>
+    </w:lvl>
+    <w:lvl w:ilvl="6" w:tplc="0C090001" w:tentative="1">
+      <w:start w:val="1"/>
+      <w:numFmt w:val="bullet"/>
+      <w:lvlText w:val=""/>
+      <w:lvlJc w:val="left"/>
+      <w:pPr>
+        <w:ind w:left="5040" w:hanging="360"/>
+      </w:pPr>
+      <w:rPr>
+        <w:rFonts w:ascii="Symbol" w:hAnsi="Symbol" w:hint="default"/>
+      </w:rPr>
+    </w:lvl>
+    <w:lvl w:ilvl="7" w:tplc="0C090003" w:tentative="1">
+      <w:start w:val="1"/>
+      <w:numFmt w:val="bullet"/>
+      <w:lvlText w:val="o"/>
+      <w:lvlJc w:val="left"/>
+      <w:pPr>
+        <w:ind w:left="5760" w:hanging="360"/>
+      </w:pPr>
+      <w:rPr>
+        <w:rFonts w:ascii="Courier New" w:hAnsi="Courier New" w:cs="Courier New" w:hint="default"/>
+      </w:rPr>
+    </w:lvl>
+    <w:lvl w:ilvl="8" w:tplc="0C090005" w:tentative="1">
+      <w:start w:val="1"/>
+      <w:numFmt w:val="bullet"/>
+      <w:lvlText w:val=""/>
+      <w:lvlJc w:val="left"/>
+      <w:pPr>
+        <w:ind w:left="6480" w:hanging="360"/>
+      </w:pPr>
+      <w:rPr>
+        <w:rFonts w:ascii="Wingdings" w:hAnsi="Wingdings" w:hint="default"/>
+      </w:rPr>
+    </w:lvl>
+  </w:abstractNum>
+  <w:num w:numId="1" w16cid:durableId="697312818">
+    <w:abstractNumId w:val="2"/>
+  </w:num>
+  <w:num w:numId="2" w16cid:durableId="489100746">
+    <w:abstractNumId w:val="0"/>
+  </w:num>
+  <w:num w:numId="3" w16cid:durableId="2114353432">
+    <w:abstractNumId w:val="1"/>
+  </w:num>
+</w:numbering>
 </file>
 
 <file path=word/styles.xml><?xml version="1.0" encoding="utf-8"?>

</xml_diff>

<commit_message>
added basic connection to db
</commit_message>
<xml_diff>
--- a/Memorandum.docx
+++ b/Memorandum.docx
@@ -354,6 +354,32 @@
           <w:szCs w:val="20"/>
         </w:rPr>
       </w:pPr>
+      <w:proofErr w:type="spellStart"/>
+      <w:r>
+        <w:rPr>
+          <w:rFonts w:ascii="Arial" w:hAnsi="Arial" w:cs="Arial"/>
+          <w:sz w:val="20"/>
+          <w:szCs w:val="20"/>
+        </w:rPr>
+        <w:t>Pword</w:t>
+      </w:r>
+      <w:proofErr w:type="spellEnd"/>
+      <w:r>
+        <w:rPr>
+          <w:rFonts w:ascii="Arial" w:hAnsi="Arial" w:cs="Arial"/>
+          <w:sz w:val="20"/>
+          <w:szCs w:val="20"/>
+        </w:rPr>
+        <w:t xml:space="preserve">: </w:t>
+      </w:r>
+      <w:r>
+        <w:rPr>
+          <w:rFonts w:ascii="Arial" w:hAnsi="Arial" w:cs="Arial"/>
+          <w:sz w:val="20"/>
+          <w:szCs w:val="20"/>
+        </w:rPr>
+        <w:t>p7tU9BIoKf18t4av</w:t>
+      </w:r>
     </w:p>
     <w:sectPr>
       <w:pgSz w:w="11906" w:h="16838"/>

</xml_diff>

<commit_message>
added order creation logic
</commit_message>
<xml_diff>
--- a/Memorandum.docx
+++ b/Memorandum.docx
@@ -267,7 +267,7 @@
           <w:sz w:val="20"/>
           <w:szCs w:val="20"/>
         </w:rPr>
-        <w:t>Optimise for price</w:t>
+        <w:t>Include feedback from managers</w:t>
       </w:r>
     </w:p>
     <w:p>
@@ -291,15 +291,31 @@
           <w:sz w:val="20"/>
           <w:szCs w:val="20"/>
         </w:rPr>
-        <w:t>Include manager feedback</w:t>
+        <w:t>Optimise for price</w:t>
       </w:r>
+    </w:p>
+    <w:p>
+      <w:pPr>
+        <w:pStyle w:val="ListParagraph"/>
+        <w:numPr>
+          <w:ilvl w:val="0"/>
+          <w:numId w:val="3"/>
+        </w:numPr>
+        <w:spacing w:line="240" w:lineRule="auto"/>
+        <w:jc w:val="both"/>
+        <w:rPr>
+          <w:rFonts w:ascii="Arial" w:hAnsi="Arial" w:cs="Arial"/>
+          <w:sz w:val="20"/>
+          <w:szCs w:val="20"/>
+        </w:rPr>
+      </w:pPr>
       <w:r>
         <w:rPr>
           <w:rFonts w:ascii="Arial" w:hAnsi="Arial" w:cs="Arial"/>
           <w:sz w:val="20"/>
           <w:szCs w:val="20"/>
         </w:rPr>
-        <w:t xml:space="preserve"> and detect quality drift</w:t>
+        <w:t>Detect quality drift</w:t>
       </w:r>
     </w:p>
     <w:p>

</xml_diff>

<commit_message>
updated db to include emails for caterer main contacts and chefs
</commit_message>
<xml_diff>
--- a/Memorandum.docx
+++ b/Memorandum.docx
@@ -359,6 +359,14 @@
         </w:rPr>
         <w:t>Design something stupidly simple that works first, then extend repeatedly, ensuring a stable functional version is created after every extension.</w:t>
       </w:r>
+      <w:r>
+        <w:rPr>
+          <w:rFonts w:ascii="Arial" w:hAnsi="Arial" w:cs="Arial"/>
+          <w:sz w:val="20"/>
+          <w:szCs w:val="20"/>
+        </w:rPr>
+        <w:t xml:space="preserve"> Ensure LLMs are used when absolutely necessary as every call has a chance to do something stupid.</w:t>
+      </w:r>
     </w:p>
     <w:p>
       <w:pPr>
@@ -370,23 +378,13 @@
           <w:szCs w:val="20"/>
         </w:rPr>
       </w:pPr>
-      <w:proofErr w:type="spellStart"/>
       <w:r>
         <w:rPr>
           <w:rFonts w:ascii="Arial" w:hAnsi="Arial" w:cs="Arial"/>
           <w:sz w:val="20"/>
           <w:szCs w:val="20"/>
         </w:rPr>
-        <w:t>Pword</w:t>
-      </w:r>
-      <w:proofErr w:type="spellEnd"/>
-      <w:r>
-        <w:rPr>
-          <w:rFonts w:ascii="Arial" w:hAnsi="Arial" w:cs="Arial"/>
-          <w:sz w:val="20"/>
-          <w:szCs w:val="20"/>
-        </w:rPr>
-        <w:t xml:space="preserve">: </w:t>
+        <w:t xml:space="preserve">Pword: </w:t>
       </w:r>
       <w:r>
         <w:rPr>

</xml_diff>

<commit_message>
changed llm, updated main logic and fixed fatal db flaw
</commit_message>
<xml_diff>
--- a/Memorandum.docx
+++ b/Memorandum.docx
@@ -625,7 +625,23 @@
           <w:sz w:val="20"/>
           <w:szCs w:val="20"/>
         </w:rPr>
-        <w:t xml:space="preserve"> implementing functionality in accordance with my philosophy of building in stages. As such, </w:t>
+        <w:t xml:space="preserve"> </w:t>
+      </w:r>
+      <w:r>
+        <w:rPr>
+          <w:rFonts w:ascii="Arial" w:hAnsi="Arial" w:cs="Arial"/>
+          <w:sz w:val="20"/>
+          <w:szCs w:val="20"/>
+        </w:rPr>
+        <w:t>adding functionality</w:t>
+      </w:r>
+      <w:r>
+        <w:rPr>
+          <w:rFonts w:ascii="Arial" w:hAnsi="Arial" w:cs="Arial"/>
+          <w:sz w:val="20"/>
+          <w:szCs w:val="20"/>
+        </w:rPr>
+        <w:t xml:space="preserve"> in accordance with my philosophy of building in stages. As such, </w:t>
       </w:r>
       <w:r>
         <w:rPr>

</xml_diff>